<commit_message>
Add explicit Qscore mirror equivalence diagnostic
</commit_message>
<xml_diff>
--- a/outputs/q2/第二问_完整报告.docx
+++ b/outputs/q2/第二问_完整报告.docx
@@ -4572,7 +4572,7 @@
         <w:spacing w:after="100" w:line="276" w:lineRule="auto"/>
       </w:pPr>
       <w:r>
-        <w:t>线性中心化模型和其镜像形式的预测值完全相同，镜像并不能改变偏导符号。主模型采用 q_defect=Q_score、q_quality=1-q_defect：L=c+A N^-alpha+B D^-beta+gamma q_defect^theta。于是 ∂L/∂q_defect=gamma theta q_defect^(theta-1)&gt;0，∂L/∂q_quality&lt;0；当 q_quality→1 时缺陷项趋于零，退化为经典 N-D 标度律。alpha、beta 围绕 B1 的 0.339957、0.279878 采用惩罚项松弛，lambda 取 0、0.1、1、10。</w:t>
+        <w:t>线性中心化模型和其镜像形式的预测值完全相同，镜像并不能改变偏导符号。下表逐行给出两种写法的 R²、MAE 和最大预测差，数值相同且预测差为机器精度量级；因此不能把 Q_quality=1-Q_score 或 |Q_score-1| 当作物理纠偏。主模型采用 q_defect=Q_score、q_quality=1-q_defect：L=c+A N^-alpha+B D^-beta+gamma q_defect^theta。于是 ∂L/∂q_defect=gamma theta q_defect^(theta-1)&gt;0，∂L/∂q_quality&lt;0；当 q_quality→1 时缺陷项趋于零，退化为经典 N-D 标度律。alpha、beta 围绕 B1 的 0.339957、0.279878 采用惩罚项松弛，lambda 取 0、0.1、1、10。</w:t>
       </w:r>
     </w:p>
     <w:tbl>
@@ -5510,6 +5510,223 @@
                 <w:sz w:val="15"/>
               </w:rPr>
               <w:t>0.384332</w:t>
+            </w:r>
+          </w:p>
+        </w:tc>
+      </w:tr>
+    </w:tbl>
+    <w:p>
+      <w:r>
+        <w:br w:type="page"/>
+      </w:r>
+    </w:p>
+    <w:tbl>
+      <w:tblPr>
+        <w:tblStyle w:val="TableGrid"/>
+        <w:tblW w:type="auto" w:w="0"/>
+        <w:jc w:val="center"/>
+        <w:tblLook w:firstColumn="1" w:firstRow="1" w:lastColumn="0" w:lastRow="0" w:noHBand="0" w:noVBand="1" w:val="04A0"/>
+        <w:tblBorders>
+          <w:top w:val="single" w:sz="4" w:color="D9D9D9"/>
+          <w:left w:val="single" w:sz="4" w:color="D9D9D9"/>
+          <w:bottom w:val="single" w:sz="4" w:color="D9D9D9"/>
+          <w:right w:val="single" w:sz="4" w:color="D9D9D9"/>
+          <w:insideH w:val="single" w:sz="4" w:color="D9D9D9"/>
+          <w:insideV w:val="single" w:sz="4" w:color="D9D9D9"/>
+        </w:tblBorders>
+      </w:tblPr>
+      <w:tblGrid>
+        <w:gridCol w:w="2520"/>
+        <w:gridCol w:w="2520"/>
+        <w:gridCol w:w="2520"/>
+        <w:gridCol w:w="2520"/>
+      </w:tblGrid>
+      <w:tr>
+        <w:tc>
+          <w:tcPr>
+            <w:tcW w:type="dxa" w:w="2520"/>
+            <w:shd w:fill="1F4E78"/>
+            <w:vAlign w:val="center"/>
+          </w:tcPr>
+          <w:p>
+            <w:r>
+              <w:rPr>
+                <w:b/>
+                <w:color w:val="FFFFFF"/>
+                <w:sz w:val="15"/>
+              </w:rPr>
+              <w:t>form</w:t>
+            </w:r>
+          </w:p>
+        </w:tc>
+        <w:tc>
+          <w:tcPr>
+            <w:tcW w:type="dxa" w:w="2520"/>
+            <w:shd w:fill="1F4E78"/>
+            <w:vAlign w:val="center"/>
+          </w:tcPr>
+          <w:p>
+            <w:r>
+              <w:rPr>
+                <w:b/>
+                <w:color w:val="FFFFFF"/>
+                <w:sz w:val="15"/>
+              </w:rPr>
+              <w:t>r2</w:t>
+            </w:r>
+          </w:p>
+        </w:tc>
+        <w:tc>
+          <w:tcPr>
+            <w:tcW w:type="dxa" w:w="2520"/>
+            <w:shd w:fill="1F4E78"/>
+            <w:vAlign w:val="center"/>
+          </w:tcPr>
+          <w:p>
+            <w:r>
+              <w:rPr>
+                <w:b/>
+                <w:color w:val="FFFFFF"/>
+                <w:sz w:val="15"/>
+              </w:rPr>
+              <w:t>mae</w:t>
+            </w:r>
+          </w:p>
+        </w:tc>
+        <w:tc>
+          <w:tcPr>
+            <w:tcW w:type="dxa" w:w="2520"/>
+            <w:shd w:fill="1F4E78"/>
+            <w:vAlign w:val="center"/>
+          </w:tcPr>
+          <w:p>
+            <w:r>
+              <w:rPr>
+                <w:b/>
+                <w:color w:val="FFFFFF"/>
+                <w:sz w:val="15"/>
+              </w:rPr>
+              <w:t>max_abs_prediction_difference_vs_centered</w:t>
+            </w:r>
+          </w:p>
+        </w:tc>
+      </w:tr>
+      <w:tr>
+        <w:tc>
+          <w:tcPr>
+            <w:tcW w:type="dxa" w:w="2520"/>
+            <w:vAlign w:val="center"/>
+            <w:shd w:fill="F3F6F9"/>
+          </w:tcPr>
+          <w:p>
+            <w:r>
+              <w:rPr>
+                <w:sz w:val="15"/>
+              </w:rPr>
+              <w:t>centered Q_score</w:t>
+            </w:r>
+          </w:p>
+        </w:tc>
+        <w:tc>
+          <w:tcPr>
+            <w:tcW w:type="dxa" w:w="2520"/>
+            <w:vAlign w:val="center"/>
+            <w:shd w:fill="F3F6F9"/>
+          </w:tcPr>
+          <w:p>
+            <w:r>
+              <w:rPr>
+                <w:sz w:val="15"/>
+              </w:rPr>
+              <w:t>0.591198953</w:t>
+            </w:r>
+          </w:p>
+        </w:tc>
+        <w:tc>
+          <w:tcPr>
+            <w:tcW w:type="dxa" w:w="2520"/>
+            <w:vAlign w:val="center"/>
+            <w:shd w:fill="F3F6F9"/>
+          </w:tcPr>
+          <w:p>
+            <w:r>
+              <w:rPr>
+                <w:sz w:val="15"/>
+              </w:rPr>
+              <w:t>0.364949943</w:t>
+            </w:r>
+          </w:p>
+        </w:tc>
+        <w:tc>
+          <w:tcPr>
+            <w:tcW w:type="dxa" w:w="2520"/>
+            <w:vAlign w:val="center"/>
+            <w:shd w:fill="F3F6F9"/>
+          </w:tcPr>
+          <w:p>
+            <w:r>
+              <w:rPr>
+                <w:sz w:val="15"/>
+              </w:rPr>
+              <w:t>0.000000000</w:t>
+            </w:r>
+          </w:p>
+        </w:tc>
+      </w:tr>
+      <w:tr>
+        <w:tc>
+          <w:tcPr>
+            <w:tcW w:type="dxa" w:w="2520"/>
+            <w:vAlign w:val="center"/>
+          </w:tcPr>
+          <w:p>
+            <w:r>
+              <w:rPr>
+                <w:sz w:val="15"/>
+              </w:rPr>
+              <w:t>mirrored |Q_score-1| = 1-Q_score</w:t>
+            </w:r>
+          </w:p>
+        </w:tc>
+        <w:tc>
+          <w:tcPr>
+            <w:tcW w:type="dxa" w:w="2520"/>
+            <w:vAlign w:val="center"/>
+          </w:tcPr>
+          <w:p>
+            <w:r>
+              <w:rPr>
+                <w:sz w:val="15"/>
+              </w:rPr>
+              <w:t>0.591198953</w:t>
+            </w:r>
+          </w:p>
+        </w:tc>
+        <w:tc>
+          <w:tcPr>
+            <w:tcW w:type="dxa" w:w="2520"/>
+            <w:vAlign w:val="center"/>
+          </w:tcPr>
+          <w:p>
+            <w:r>
+              <w:rPr>
+                <w:sz w:val="15"/>
+              </w:rPr>
+              <w:t>0.364949943</w:t>
+            </w:r>
+          </w:p>
+        </w:tc>
+        <w:tc>
+          <w:tcPr>
+            <w:tcW w:type="dxa" w:w="2520"/>
+            <w:vAlign w:val="center"/>
+          </w:tcPr>
+          <w:p>
+            <w:r>
+              <w:rPr>
+                <w:sz w:val="15"/>
+              </w:rPr>
+              <w:t>0.000000000</w:t>
             </w:r>
           </w:p>
         </w:tc>

</xml_diff>